<commit_message>
Rename the application labels to TAXPAYER, AMOUNT and TIMING
WHO becomes TAXPAYER, HOW MUCH becomes AMOUNT, WHEN becomes TIMING,
across all 53 occurrences including the combined headings and the
explanation in the introduction. Still 12 pages.

Co-Authored-By: Claude Opus 5 <noreply@anthropic.com>
Claude-Session: https://claude.ai/code/session_01SvXj76DdTNWmjbTHo7jSVU
</commit_message>
<xml_diff>
--- a/research/Axion-Doc7-Income-Tax-Research.docx
+++ b/research/Axion-Doc7-Income-Tax-Research.docx
@@ -230,7 +230,7 @@
                 <w:sz w:val="18"/>
                 <w:szCs w:val="18"/>
               </w:rPr>
-              <w:t xml:space="preserve">WHO</w:t>
+              <w:t xml:space="preserve">TAXPAYER</w:t>
             </w:r>
             <w:r>
               <w:rPr>
@@ -256,7 +256,7 @@
                 <w:sz w:val="18"/>
                 <w:szCs w:val="18"/>
               </w:rPr>
-              <w:t xml:space="preserve">HOW MUCH</w:t>
+              <w:t xml:space="preserve">AMOUNT</w:t>
             </w:r>
             <w:r>
               <w:rPr>
@@ -282,7 +282,7 @@
                 <w:sz w:val="18"/>
                 <w:szCs w:val="18"/>
               </w:rPr>
-              <w:t xml:space="preserve">WHEN</w:t>
+              <w:t xml:space="preserve">TIMING</w:t>
             </w:r>
             <w:r>
               <w:rPr>
@@ -3362,7 +3362,7 @@
                 <w:sz w:val="18"/>
                 <w:szCs w:val="18"/>
               </w:rPr>
-              <w:t xml:space="preserve">WHO</w:t>
+              <w:t xml:space="preserve">TAXPAYER</w:t>
             </w:r>
             <w:r>
               <w:rPr>
@@ -3433,7 +3433,7 @@
                 <w:sz w:val="18"/>
                 <w:szCs w:val="18"/>
               </w:rPr>
-              <w:t xml:space="preserve">HOW MUCH / WHEN</w:t>
+              <w:t xml:space="preserve">AMOUNT / TIMING</w:t>
             </w:r>
             <w:r>
               <w:rPr>
@@ -3583,7 +3583,7 @@
                 <w:sz w:val="18"/>
                 <w:szCs w:val="18"/>
               </w:rPr>
-              <w:t xml:space="preserve">WHO</w:t>
+              <w:t xml:space="preserve">TAXPAYER</w:t>
             </w:r>
             <w:r>
               <w:rPr>
@@ -3786,7 +3786,7 @@
                 <w:sz w:val="18"/>
                 <w:szCs w:val="18"/>
               </w:rPr>
-              <w:t xml:space="preserve">WHO</w:t>
+              <w:t xml:space="preserve">TAXPAYER</w:t>
             </w:r>
             <w:r>
               <w:rPr>
@@ -3889,7 +3889,7 @@
                 <w:sz w:val="18"/>
                 <w:szCs w:val="18"/>
               </w:rPr>
-              <w:t xml:space="preserve">HOW MUCH</w:t>
+              <w:t xml:space="preserve">AMOUNT</w:t>
             </w:r>
             <w:r>
               <w:rPr>
@@ -3947,7 +3947,7 @@
                 <w:sz w:val="18"/>
                 <w:szCs w:val="18"/>
               </w:rPr>
-              <w:t xml:space="preserve">WHEN</w:t>
+              <w:t xml:space="preserve">TIMING</w:t>
             </w:r>
             <w:r>
               <w:rPr>
@@ -5990,7 +5990,7 @@
                 <w:sz w:val="18"/>
                 <w:szCs w:val="18"/>
               </w:rPr>
-              <w:t xml:space="preserve">WHO</w:t>
+              <w:t xml:space="preserve">TAXPAYER</w:t>
             </w:r>
             <w:r>
               <w:rPr>
@@ -6317,7 +6317,7 @@
                 <w:sz w:val="18"/>
                 <w:szCs w:val="18"/>
               </w:rPr>
-              <w:t xml:space="preserve">HOW MUCH</w:t>
+              <w:t xml:space="preserve">AMOUNT</w:t>
             </w:r>
             <w:r>
               <w:rPr>
@@ -6559,7 +6559,7 @@
                 <w:sz w:val="18"/>
                 <w:szCs w:val="18"/>
               </w:rPr>
-              <w:t xml:space="preserve">WHEN</w:t>
+              <w:t xml:space="preserve">TIMING</w:t>
             </w:r>
             <w:r>
               <w:rPr>
@@ -7537,7 +7537,7 @@
                 <w:sz w:val="18"/>
                 <w:szCs w:val="18"/>
               </w:rPr>
-              <w:t xml:space="preserve">WHO / HOW MUCH / WHEN</w:t>
+              <w:t xml:space="preserve">TAXPAYER / AMOUNT / TIMING</w:t>
             </w:r>
             <w:r>
               <w:rPr>
@@ -7837,7 +7837,7 @@
                 <w:sz w:val="18"/>
                 <w:szCs w:val="18"/>
               </w:rPr>
-              <w:t xml:space="preserve">WHO / HOW MUCH / WHEN</w:t>
+              <w:t xml:space="preserve">TAXPAYER / AMOUNT / TIMING</w:t>
             </w:r>
             <w:r>
               <w:rPr>
@@ -8855,7 +8855,7 @@
                 <w:sz w:val="18"/>
                 <w:szCs w:val="18"/>
               </w:rPr>
-              <w:t xml:space="preserve">WHO / HOW MUCH / WHEN — not available on this investment.</w:t>
+              <w:t xml:space="preserve">TAXPAYER / AMOUNT / TIMING — not available on this investment.</w:t>
             </w:r>
             <w:r>
               <w:rPr>
@@ -9383,7 +9383,7 @@
                 <w:sz w:val="18"/>
                 <w:szCs w:val="18"/>
               </w:rPr>
-              <w:t xml:space="preserve">WHO</w:t>
+              <w:t xml:space="preserve">TAXPAYER</w:t>
             </w:r>
             <w:r>
               <w:rPr>
@@ -9512,7 +9512,7 @@
                 <w:sz w:val="18"/>
                 <w:szCs w:val="18"/>
               </w:rPr>
-              <w:t xml:space="preserve">HOW MUCH</w:t>
+              <w:t xml:space="preserve">AMOUNT</w:t>
             </w:r>
             <w:r>
               <w:rPr>
@@ -9998,7 +9998,7 @@
                 <w:sz w:val="18"/>
                 <w:szCs w:val="18"/>
               </w:rPr>
-              <w:t xml:space="preserve">WHEN</w:t>
+              <w:t xml:space="preserve">TIMING</w:t>
             </w:r>
             <w:r>
               <w:rPr>
@@ -10473,7 +10473,7 @@
                 <w:sz w:val="18"/>
                 <w:szCs w:val="18"/>
               </w:rPr>
-              <w:t xml:space="preserve">WHO</w:t>
+              <w:t xml:space="preserve">TAXPAYER</w:t>
             </w:r>
             <w:r>
               <w:rPr>
@@ -10499,7 +10499,7 @@
                 <w:sz w:val="18"/>
                 <w:szCs w:val="18"/>
               </w:rPr>
-              <w:t xml:space="preserve">HOW MUCH</w:t>
+              <w:t xml:space="preserve">AMOUNT</w:t>
             </w:r>
             <w:r>
               <w:rPr>
@@ -10525,7 +10525,7 @@
                 <w:sz w:val="18"/>
                 <w:szCs w:val="18"/>
               </w:rPr>
-              <w:t xml:space="preserve">WHEN</w:t>
+              <w:t xml:space="preserve">TIMING</w:t>
             </w:r>
             <w:r>
               <w:rPr>
@@ -10884,7 +10884,7 @@
                 <w:sz w:val="18"/>
                 <w:szCs w:val="18"/>
               </w:rPr>
-              <w:t xml:space="preserve">WHO</w:t>
+              <w:t xml:space="preserve">TAXPAYER</w:t>
             </w:r>
             <w:r>
               <w:rPr>
@@ -10910,7 +10910,7 @@
                 <w:sz w:val="18"/>
                 <w:szCs w:val="18"/>
               </w:rPr>
-              <w:t xml:space="preserve">HOW MUCH</w:t>
+              <w:t xml:space="preserve">AMOUNT</w:t>
             </w:r>
             <w:r>
               <w:rPr>
@@ -10936,7 +10936,7 @@
                 <w:sz w:val="18"/>
                 <w:szCs w:val="18"/>
               </w:rPr>
-              <w:t xml:space="preserve">WHEN</w:t>
+              <w:t xml:space="preserve">TIMING</w:t>
             </w:r>
             <w:r>
               <w:rPr>
@@ -11725,7 +11725,7 @@
                 <w:sz w:val="18"/>
                 <w:szCs w:val="18"/>
               </w:rPr>
-              <w:t xml:space="preserve">WHO</w:t>
+              <w:t xml:space="preserve">TAXPAYER</w:t>
             </w:r>
             <w:r>
               <w:rPr>
@@ -13056,7 +13056,7 @@
                 <w:sz w:val="18"/>
                 <w:szCs w:val="18"/>
               </w:rPr>
-              <w:t xml:space="preserve">WHO</w:t>
+              <w:t xml:space="preserve">TAXPAYER</w:t>
             </w:r>
             <w:r>
               <w:rPr>
@@ -13082,7 +13082,7 @@
                 <w:sz w:val="18"/>
                 <w:szCs w:val="18"/>
               </w:rPr>
-              <w:t xml:space="preserve">WHEN</w:t>
+              <w:t xml:space="preserve">TIMING</w:t>
             </w:r>
             <w:r>
               <w:rPr>
@@ -13650,7 +13650,7 @@
                 <w:sz w:val="18"/>
                 <w:szCs w:val="18"/>
               </w:rPr>
-              <w:t xml:space="preserve">WHEN</w:t>
+              <w:t xml:space="preserve">TIMING</w:t>
             </w:r>
             <w:r>
               <w:rPr>
@@ -14617,7 +14617,7 @@
                 <w:sz w:val="18"/>
                 <w:szCs w:val="18"/>
               </w:rPr>
-              <w:t xml:space="preserve">HOW MUCH</w:t>
+              <w:t xml:space="preserve">AMOUNT</w:t>
             </w:r>
             <w:r>
               <w:rPr>
@@ -14643,7 +14643,7 @@
                 <w:sz w:val="18"/>
                 <w:szCs w:val="18"/>
               </w:rPr>
-              <w:t xml:space="preserve">WHEN</w:t>
+              <w:t xml:space="preserve">TIMING</w:t>
             </w:r>
             <w:r>
               <w:rPr>
@@ -17059,7 +17059,7 @@
                 <w:sz w:val="18"/>
                 <w:szCs w:val="18"/>
               </w:rPr>
-              <w:t xml:space="preserve">WHO</w:t>
+              <w:t xml:space="preserve">TAXPAYER</w:t>
             </w:r>
           </w:p>
         </w:tc>
@@ -17206,7 +17206,7 @@
                 <w:sz w:val="18"/>
                 <w:szCs w:val="18"/>
               </w:rPr>
-              <w:t xml:space="preserve">HOW MUCH to Axion</w:t>
+              <w:t xml:space="preserve">AMOUNT to Axion</w:t>
             </w:r>
           </w:p>
         </w:tc>
@@ -19158,7 +19158,7 @@
                 <w:sz w:val="18"/>
                 <w:szCs w:val="18"/>
               </w:rPr>
-              <w:t xml:space="preserve">WHO</w:t>
+              <w:t xml:space="preserve">TAXPAYER</w:t>
             </w:r>
             <w:r>
               <w:rPr>
@@ -19776,7 +19776,7 @@
                 <w:sz w:val="18"/>
                 <w:szCs w:val="18"/>
               </w:rPr>
-              <w:t xml:space="preserve">WHO</w:t>
+              <w:t xml:space="preserve">TAXPAYER</w:t>
             </w:r>
             <w:r>
               <w:rPr>
@@ -19802,7 +19802,7 @@
                 <w:sz w:val="18"/>
                 <w:szCs w:val="18"/>
               </w:rPr>
-              <w:t xml:space="preserve">HOW MUCH</w:t>
+              <w:t xml:space="preserve">AMOUNT</w:t>
             </w:r>
             <w:r>
               <w:rPr>
@@ -19854,7 +19854,7 @@
                 <w:sz w:val="18"/>
                 <w:szCs w:val="18"/>
               </w:rPr>
-              <w:t xml:space="preserve">WHEN</w:t>
+              <w:t xml:space="preserve">TIMING</w:t>
             </w:r>
             <w:r>
               <w:rPr>
@@ -21826,7 +21826,7 @@
                 <w:sz w:val="18"/>
                 <w:szCs w:val="18"/>
               </w:rPr>
-              <w:t xml:space="preserve">WHO</w:t>
+              <w:t xml:space="preserve">TAXPAYER</w:t>
             </w:r>
             <w:r>
               <w:rPr>
@@ -21858,7 +21858,7 @@
                 <w:sz w:val="18"/>
                 <w:szCs w:val="18"/>
               </w:rPr>
-              <w:t xml:space="preserve">HOW MUCH</w:t>
+              <w:t xml:space="preserve">AMOUNT</w:t>
             </w:r>
             <w:r>
               <w:rPr>
@@ -21916,7 +21916,7 @@
                 <w:sz w:val="18"/>
                 <w:szCs w:val="18"/>
               </w:rPr>
-              <w:t xml:space="preserve">WHEN</w:t>
+              <w:t xml:space="preserve">TIMING</w:t>
             </w:r>
             <w:r>
               <w:rPr>
@@ -24442,7 +24442,7 @@
                 <w:sz w:val="18"/>
                 <w:szCs w:val="18"/>
               </w:rPr>
-              <w:t xml:space="preserve">WHO</w:t>
+              <w:t xml:space="preserve">TAXPAYER</w:t>
             </w:r>
             <w:r>
               <w:rPr>
@@ -24468,7 +24468,7 @@
                 <w:sz w:val="18"/>
                 <w:szCs w:val="18"/>
               </w:rPr>
-              <w:t xml:space="preserve">HOW MUCH / WHEN</w:t>
+              <w:t xml:space="preserve">AMOUNT / TIMING</w:t>
             </w:r>
             <w:r>
               <w:rPr>
@@ -24808,7 +24808,7 @@
                 <w:sz w:val="18"/>
                 <w:szCs w:val="18"/>
               </w:rPr>
-              <w:t xml:space="preserve">WHEN</w:t>
+              <w:t xml:space="preserve">TIMING</w:t>
             </w:r>
             <w:r>
               <w:rPr>
@@ -26589,7 +26589,7 @@
                 <w:sz w:val="18"/>
                 <w:szCs w:val="18"/>
               </w:rPr>
-              <w:t xml:space="preserve">WHO</w:t>
+              <w:t xml:space="preserve">TAXPAYER</w:t>
             </w:r>
             <w:r>
               <w:rPr>
@@ -26968,7 +26968,7 @@
                 <w:sz w:val="18"/>
                 <w:szCs w:val="18"/>
               </w:rPr>
-              <w:t xml:space="preserve">HOW MUCH</w:t>
+              <w:t xml:space="preserve">AMOUNT</w:t>
             </w:r>
           </w:p>
         </w:tc>
@@ -27151,7 +27151,7 @@
                 <w:sz w:val="18"/>
                 <w:szCs w:val="18"/>
               </w:rPr>
-              <w:t xml:space="preserve">WHEN</w:t>
+              <w:t xml:space="preserve">TIMING</w:t>
             </w:r>
           </w:p>
         </w:tc>

</xml_diff>

<commit_message>
Simplify the notes under the Investment 4 worked example
Each note now opens with a bold label naming the point, followed by one or
two short sentences. Previously each ran as a single long sentence that
mixed the section, the case, the figures and the reasoning.

- "How the table reads against each section in the Investment 4 table"
  becomes "Reading the table"
- Timing, Unused volume, Why it qualifies, VAT and What the waste costs
  are the five labels
- the R39 160 000 and R28 586 800 figures are kept, stated once each

Still 19 pages.

Co-Authored-By: Claude Opus 5 <noreply@anthropic.com>
Claude-Session: https://claude.ai/code/session_01SvXj76DdTNWmjbTHo7jSVU
</commit_message>
<xml_diff>
--- a/research/Axion-Doc7-Income-Tax-Research.docx
+++ b/research/Axion-Doc7-Income-Tax-Research.docx
@@ -24828,7 +24828,7 @@
           <w:b/>
           <w:color w:val="0070C0"/>
         </w:rPr>
-        <w:t>How the table reads against each section in the Investment 4 table</w:t>
+        <w:t>Reading the table</w:t>
       </w:r>
     </w:p>
     <w:p>
@@ -24842,9 +24842,17 @@
       </w:pPr>
       <w:r>
         <w:rPr>
+          <w:b/>
           <w:color w:val="0070C0"/>
         </w:rPr>
-        <w:t>s11(a) timing (Edgars Stores / Nasionale Pers) — no deduction arises on signature. Each year is deducted only when that year’s obligation becomes unconditional, which is why the deduction rises from R88 000 000 to R98 876 800 as the price escalates rather than being fixed at the Year 1 price.</w:t>
+        <w:t xml:space="preserve">Timing — s11(a); Edgars Stores / Nasionale Pers. </w:t>
+      </w:r>
+      <w:r>
+        <w:rPr>
+          <w:b w:val="0"/>
+          <w:color w:val="0070C0"/>
+        </w:rPr>
+        <w:t>Nothing is deducted on signature. Each year is deducted only once that year’s obligation becomes unconditional, which is why the deduction grows with the price from R88 000 000 to R98 876 800.</w:t>
       </w:r>
     </w:p>
     <w:p>
@@ -24858,9 +24866,17 @@
       </w:pPr>
       <w:r>
         <w:rPr>
+          <w:b/>
           <w:color w:val="0070C0"/>
         </w:rPr>
-        <w:t>s11(a) unused volume (Warner Lambert / Sub-Nigel) — R27 500 000 in Year 1 and R11 660 000 in Year 2, R39 160 000 in total, is deductible in full although no electricity was received. The purpose of the expenditure is the decisive consideration, and relief of R10 573 200 follows.</w:t>
+        <w:t xml:space="preserve">Unused volume — s11(a); Warner Lambert / Sub-Nigel. </w:t>
+      </w:r>
+      <w:r>
+        <w:rPr>
+          <w:b w:val="0"/>
+          <w:color w:val="0070C0"/>
+        </w:rPr>
+        <w:t>R39 160 000 over the three years buys no electricity, but is still deductible in full. The purpose of the expenditure decides the deduction, not the outcome.</w:t>
       </w:r>
     </w:p>
     <w:p>
@@ -24874,9 +24890,17 @@
       </w:pPr>
       <w:r>
         <w:rPr>
+          <w:b/>
           <w:color w:val="0070C0"/>
         </w:rPr>
-        <w:t>PE Tramways / Joffe — committing to volume ahead of utilisation is an inevitable concomitant of securing supply for capacity still being built, so the cost is incurred in the production of income.</w:t>
+        <w:t xml:space="preserve">Why it qualifies — PE Tramways / Joffe. </w:t>
+      </w:r>
+      <w:r>
+        <w:rPr>
+          <w:b w:val="0"/>
+          <w:color w:val="0070C0"/>
+        </w:rPr>
+        <w:t>Contracting ahead of utilisation is unavoidable when securing supply for capacity still being built, so the cost is incurred in the production of income.</w:t>
       </w:r>
     </w:p>
     <w:p>
@@ -24890,9 +24914,17 @@
       </w:pPr>
       <w:r>
         <w:rPr>
+          <w:b/>
           <w:color w:val="0070C0"/>
         </w:rPr>
-        <w:t>VAT — input tax is deductible on the full invoice, including the volume not consumed, so VAT is neutral and does not reduce the cost of the unused electricity.</w:t>
+        <w:t xml:space="preserve">VAT. </w:t>
+      </w:r>
+      <w:r>
+        <w:rPr>
+          <w:b w:val="0"/>
+          <w:color w:val="0070C0"/>
+        </w:rPr>
+        <w:t>Input tax is claimed on the whole invoice, including the unused volume, so VAT is neutral and does not soften the waste.</w:t>
       </w:r>
     </w:p>
     <w:p>
@@ -24906,9 +24938,17 @@
       </w:pPr>
       <w:r>
         <w:rPr>
+          <w:b/>
           <w:color w:val="0070C0"/>
         </w:rPr>
-        <w:t>The wasted volume is relieved at 27%, so Axion bears 73 cents in every rand of a cost that delivers no electricity — R28 586 800 of the R39 160 000 over the three years.</w:t>
+        <w:t xml:space="preserve">What the waste costs. </w:t>
+      </w:r>
+      <w:r>
+        <w:rPr>
+          <w:b w:val="0"/>
+          <w:color w:val="0070C0"/>
+        </w:rPr>
+        <w:t>Relief at 27% leaves Axion bearing R28 586 800 of the R39 160 000 paid for electricity it never received.</w:t>
       </w:r>
     </w:p>
     <w:p>

</xml_diff>

<commit_message>
Use one font and a consistent heading hierarchy throughout
- Theme major/minor fonts set to Arial (they were Aptos Display/Aptos,
  which the contents heading style was pulling in)
- Heading 1-4 styles rebuilt: Arial, bold, sized 16/13/11/9.5pt, no
  left indent, keep-with-next, consistent space before/after
- 17 sub-headings that were sitting as bold body text or as a bulleted
  list item promoted to Heading 3 (worked examples, steps, information
  required, conclusion), with their stray bullet, indent, size and
  colour overrides removed
- All nine Heading 1 paragraphs set to the same green; two empty
  heading paragraphs demoted to body text

Co-Authored-By: Claude Opus 5 <noreply@anthropic.com>
Claude-Session: https://claude.ai/code/session_01SvXj76DdTNWmjbTHo7jSVU
</commit_message>
<xml_diff>
--- a/research/Axion-Doc7-Income-Tax-Research.docx
+++ b/research/Axion-Doc7-Income-Tax-Research.docx
@@ -1189,12 +1189,16 @@
         <w:rPr>
           <w:kern w:val="36"/>
           <w14:ligatures w14:val="standardContextual"/>
+          <w:color w:val="00B050"/>
         </w:rPr>
       </w:pPr>
       <w:bookmarkStart w:id="0" w:name="_Toc240832700"/>
       <w:bookmarkStart w:id="1" w:name="_Toc240832750"/>
       <w:bookmarkStart w:id="2" w:name="_Toc240832456"/>
       <w:r>
+        <w:rPr>
+          <w:color w:val="00B050"/>
+        </w:rPr>
         <w:lastRenderedPageBreak/>
         <w:t>Summary – the four opportunities side by side</w:t>
       </w:r>
@@ -2400,19 +2404,31 @@
       <w:bookmarkStart w:id="3" w:name="_Toc240832701"/>
       <w:bookmarkStart w:id="4" w:name="_Toc240832751"/>
       <w:r>
+        <w:rPr>
+          <w:color w:val="00B050"/>
+        </w:rPr>
         <w:lastRenderedPageBreak/>
         <w:t xml:space="preserve">Case law </w:t>
       </w:r>
       <w:r>
+        <w:rPr>
+          <w:color w:val="00B050"/>
+        </w:rPr>
         <w:t>–</w:t>
       </w:r>
       <w:r>
+        <w:rPr>
+          <w:color w:val="00B050"/>
+        </w:rPr>
         <w:t xml:space="preserve"> principles applied in this document</w:t>
       </w:r>
       <w:bookmarkEnd w:id="2"/>
       <w:bookmarkEnd w:id="3"/>
       <w:bookmarkEnd w:id="4"/>
       <w:r>
+        <w:rPr>
+          <w:color w:val="00B050"/>
+        </w:rPr>
         <w:br/>
       </w:r>
     </w:p>
@@ -3443,15 +3459,11 @@
       </w:pPr>
     </w:p>
     <w:p>
-      <w:pPr>
-        <w:pStyle w:val="Heading1"/>
-      </w:pPr>
+      <w:pPr/>
       <w:bookmarkStart w:id="5" w:name="_Toc240832457"/>
     </w:p>
     <w:p>
-      <w:pPr>
-        <w:pStyle w:val="Heading1"/>
-      </w:pPr>
+      <w:pPr/>
     </w:p>
     <w:p>
       <w:pPr>
@@ -3460,12 +3472,18 @@
       <w:bookmarkStart w:id="6" w:name="_Toc240832702"/>
       <w:bookmarkStart w:id="7" w:name="_Toc240832752"/>
       <w:r>
+        <w:rPr>
+          <w:color w:val="00B050"/>
+        </w:rPr>
         <w:t>The investment opportunities, as Document 7 states them</w:t>
       </w:r>
       <w:bookmarkEnd w:id="5"/>
       <w:bookmarkEnd w:id="6"/>
       <w:bookmarkEnd w:id="7"/>
       <w:r>
+        <w:rPr>
+          <w:color w:val="00B050"/>
+        </w:rPr>
         <w:br/>
       </w:r>
     </w:p>
@@ -5488,6 +5506,7 @@
     </w:p>
     <w:p>
       <w:pPr>
+        <w:pStyle w:val="Heading3"/>
         <w:keepNext/>
         <w:spacing w:before="140" w:after="50" w:line="250" w:lineRule="auto"/>
       </w:pPr>
@@ -6175,6 +6194,7 @@
     </w:p>
     <w:p>
       <w:pPr>
+        <w:pStyle w:val="Heading3"/>
         <w:keepNext/>
         <w:spacing w:before="140" w:after="50" w:line="250" w:lineRule="auto"/>
       </w:pPr>
@@ -16240,6 +16260,7 @@
     </w:p>
     <w:p>
       <w:pPr>
+        <w:pStyle w:val="Heading3"/>
         <w:keepNext/>
         <w:spacing w:before="140" w:after="50" w:line="250" w:lineRule="auto"/>
       </w:pPr>
@@ -17027,6 +17048,7 @@
     </w:p>
     <w:p>
       <w:pPr>
+        <w:pStyle w:val="Heading3"/>
         <w:keepNext/>
         <w:spacing w:before="140" w:after="50" w:line="250" w:lineRule="auto"/>
       </w:pPr>
@@ -17696,6 +17718,7 @@
     </w:p>
     <w:p>
       <w:pPr>
+        <w:pStyle w:val="Heading3"/>
         <w:keepNext/>
         <w:spacing w:before="140" w:after="50" w:line="250" w:lineRule="auto"/>
       </w:pPr>
@@ -18480,6 +18503,7 @@
     </w:p>
     <w:p>
       <w:pPr>
+        <w:pStyle w:val="Heading3"/>
         <w:keepNext/>
         <w:spacing w:before="140" w:after="50" w:line="250" w:lineRule="auto"/>
       </w:pPr>
@@ -20855,6 +20879,7 @@
     </w:p>
     <w:p>
       <w:pPr>
+        <w:pStyle w:val="Heading3"/>
         <w:keepNext/>
         <w:spacing w:before="140" w:after="50" w:line="250" w:lineRule="auto"/>
       </w:pPr>
@@ -21634,6 +21659,7 @@
     </w:p>
     <w:p>
       <w:pPr>
+        <w:pStyle w:val="Heading3"/>
         <w:keepNext/>
         <w:spacing w:before="140" w:after="50" w:line="250" w:lineRule="auto"/>
       </w:pPr>
@@ -23114,6 +23140,7 @@
     </w:p>
     <w:p>
       <w:pPr>
+        <w:pStyle w:val="Heading3"/>
         <w:keepNext/>
         <w:spacing w:before="140" w:after="50" w:line="250" w:lineRule="auto"/>
       </w:pPr>
@@ -24816,17 +24843,12 @@
     </w:tbl>
     <w:p>
       <w:pPr>
-        <w:pStyle w:val="ListParagraph"/>
-        <w:numPr>
-          <w:ilvl w:val="0"/>
-          <w:numId w:val="2"/>
-        </w:numPr>
+        <w:pStyle w:val="Heading3"/>
         <w:spacing w:after="50" w:line="250" w:lineRule="auto"/>
       </w:pPr>
       <w:r>
         <w:rPr>
           <w:b/>
-          <w:color w:val="0070C0"/>
         </w:rPr>
         <w:t>Reading the table</w:t>
       </w:r>
@@ -24953,6 +24975,7 @@
     </w:p>
     <w:p>
       <w:pPr>
+        <w:pStyle w:val="Heading3"/>
         <w:keepNext/>
         <w:spacing w:before="140" w:after="50" w:line="250" w:lineRule="auto"/>
       </w:pPr>
@@ -25484,6 +25507,7 @@
     </w:p>
     <w:p>
       <w:pPr>
+        <w:pStyle w:val="Heading3"/>
         <w:keepNext/>
         <w:spacing w:before="140" w:after="50" w:line="250" w:lineRule="auto"/>
       </w:pPr>
@@ -27642,6 +27666,7 @@
     </w:tbl>
     <w:p>
       <w:pPr>
+        <w:pStyle w:val="Heading3"/>
         <w:keepNext/>
         <w:spacing w:before="140" w:after="50" w:line="249" w:lineRule="auto"/>
         <w:rPr>
@@ -28401,6 +28426,7 @@
     </w:tbl>
     <w:p>
       <w:pPr>
+        <w:pStyle w:val="Heading3"/>
         <w:keepNext/>
         <w:spacing w:before="140" w:after="50" w:line="249" w:lineRule="auto"/>
         <w:rPr>
@@ -28990,11 +29016,12 @@
         <w:rPr>
           <w:kern w:val="36"/>
           <w14:ligatures w14:val="standardContextual"/>
+          <w:color w:val="00B050"/>
         </w:rPr>
       </w:pPr>
       <w:r>
         <w:rPr>
-          <w:color w:val="000000"/>
+          <w:color w:val="00B050"/>
         </w:rPr>
         <w:lastRenderedPageBreak/>
         <w:t>Conclusion and recommendation</w:t>
@@ -29002,6 +29029,7 @@
     </w:p>
     <w:p>
       <w:pPr>
+        <w:pStyle w:val="Heading3"/>
         <w:rPr>
           <w:kern w:val="2"/>
           <w14:ligatures w14:val="standardContextual"/>
@@ -29029,6 +29057,7 @@
     </w:p>
     <w:p>
       <w:pPr>
+        <w:pStyle w:val="Heading3"/>
         <w:rPr>
           <w:kern w:val="2"/>
           <w14:ligatures w14:val="standardContextual"/>
@@ -29038,7 +29067,6 @@
         <w:rPr>
           <w:b/>
           <w:bCs/>
-          <w:color w:val="0070C0"/>
         </w:rPr>
         <w:t>Assessment framework</w:t>
       </w:r>
@@ -29175,6 +29203,7 @@
     </w:p>
     <w:p>
       <w:pPr>
+        <w:pStyle w:val="Heading3"/>
         <w:rPr>
           <w:kern w:val="2"/>
           <w14:ligatures w14:val="standardContextual"/>
@@ -33168,10 +33197,17 @@
     <w:uiPriority w:val="9"/>
     <w:qFormat/>
     <w:pPr>
+      <w:keepNext/>
+      <w:keepLines/>
+      <w:spacing w:before="240" w:after="120"/>
+      <w:ind w:left="0" w:firstLine="0"/>
       <w:outlineLvl w:val="0"/>
     </w:pPr>
     <w:rPr>
-      <w:color w:val="2E74B5"/>
+      <w:rFonts w:ascii="Arial" w:eastAsia="Arial" w:hAnsi="Arial" w:cs="Arial"/>
+      <w:b/>
+      <w:bCs/>
+      <w:color w:val="000000"/>
       <w:sz w:val="32"/>
       <w:szCs w:val="32"/>
     </w:rPr>
@@ -33183,10 +33219,17 @@
     <w:unhideWhenUsed/>
     <w:qFormat/>
     <w:pPr>
+      <w:keepNext/>
+      <w:keepLines/>
+      <w:spacing w:before="200" w:after="100"/>
+      <w:ind w:left="0" w:firstLine="0"/>
       <w:outlineLvl w:val="1"/>
     </w:pPr>
     <w:rPr>
-      <w:color w:val="2E74B5"/>
+      <w:rFonts w:ascii="Arial" w:eastAsia="Arial" w:hAnsi="Arial" w:cs="Arial"/>
+      <w:b/>
+      <w:bCs/>
+      <w:color w:val="000000"/>
       <w:sz w:val="26"/>
       <w:szCs w:val="26"/>
     </w:rPr>
@@ -33194,31 +33237,43 @@
   <w:style w:type="paragraph" w:styleId="Heading3">
     <w:name w:val="heading 3"/>
     <w:uiPriority w:val="9"/>
-    <w:semiHidden/>
     <w:unhideWhenUsed/>
     <w:qFormat/>
     <w:pPr>
+      <w:keepNext/>
+      <w:keepLines/>
+      <w:spacing w:before="180" w:after="80"/>
+      <w:ind w:left="0" w:firstLine="0"/>
       <w:outlineLvl w:val="2"/>
     </w:pPr>
     <w:rPr>
-      <w:color w:val="1F4D78"/>
-      <w:sz w:val="24"/>
-      <w:szCs w:val="24"/>
+      <w:rFonts w:ascii="Arial" w:eastAsia="Arial" w:hAnsi="Arial" w:cs="Arial"/>
+      <w:b/>
+      <w:bCs/>
+      <w:color w:val="000000"/>
+      <w:sz w:val="22"/>
+      <w:szCs w:val="22"/>
     </w:rPr>
   </w:style>
   <w:style w:type="paragraph" w:styleId="Heading4">
     <w:name w:val="heading 4"/>
     <w:uiPriority w:val="9"/>
-    <w:semiHidden/>
     <w:unhideWhenUsed/>
     <w:qFormat/>
     <w:pPr>
+      <w:keepNext/>
+      <w:keepLines/>
+      <w:spacing w:before="140" w:after="60"/>
+      <w:ind w:left="0" w:firstLine="0"/>
       <w:outlineLvl w:val="3"/>
     </w:pPr>
     <w:rPr>
-      <w:i/>
-      <w:iCs/>
-      <w:color w:val="2E74B5"/>
+      <w:rFonts w:ascii="Arial" w:eastAsia="Arial" w:hAnsi="Arial" w:cs="Arial"/>
+      <w:b/>
+      <w:bCs/>
+      <w:color w:val="000000"/>
+      <w:sz w:val="19"/>
+      <w:szCs w:val="19"/>
     </w:rPr>
   </w:style>
   <w:style w:type="paragraph" w:styleId="Heading5">
@@ -33752,7 +33807,7 @@
       <w:outlineLvl w:val="9"/>
     </w:pPr>
     <w:rPr>
-      <w:rFonts w:asciiTheme="majorHAnsi" w:eastAsiaTheme="majorEastAsia" w:hAnsiTheme="majorHAnsi" w:cstheme="majorBidi"/>
+      <w:rFonts w:ascii="Arial" w:eastAsia="Arial" w:hAnsi="Arial" w:cs="Arial"/>
       <w:color w:val="0F4761" w:themeColor="accent1" w:themeShade="BF"/>
     </w:rPr>
   </w:style>
@@ -33917,7 +33972,10 @@
     <w:link w:val="Heading2"/>
     <w:uiPriority w:val="9"/>
     <w:rPr>
-      <w:color w:val="2E74B5"/>
+      <w:rFonts w:ascii="Arial" w:eastAsia="Arial" w:hAnsi="Arial" w:cs="Arial"/>
+      <w:b/>
+      <w:bCs/>
+      <w:color w:val="000000"/>
       <w:sz w:val="26"/>
       <w:szCs w:val="26"/>
     </w:rPr>
@@ -33954,7 +34012,10 @@
     <w:uiPriority w:val="9"/>
     <w:rsid w:val="00B03767"/>
     <w:rPr>
-      <w:color w:val="2E74B5"/>
+      <w:rFonts w:ascii="Arial" w:eastAsia="Arial" w:hAnsi="Arial" w:cs="Arial"/>
+      <w:b/>
+      <w:bCs/>
+      <w:color w:val="000000"/>
       <w:sz w:val="32"/>
       <w:szCs w:val="32"/>
     </w:rPr>
@@ -34021,7 +34082,7 @@
     </a:clrScheme>
     <a:fontScheme name="Office">
       <a:majorFont>
-        <a:latin typeface="Aptos Display" panose="02110004020202020204"/>
+        <a:latin typeface="Arial" panose="02110004020202020204"/>
         <a:ea typeface=""/>
         <a:cs typeface=""/>
         <a:font script="Jpan" typeface="游ゴシック Light"/>
@@ -34073,7 +34134,7 @@
         <a:font script="Tfng" typeface="Ebrima"/>
       </a:majorFont>
       <a:minorFont>
-        <a:latin typeface="Aptos" panose="02110004020202020204"/>
+        <a:latin typeface="Arial" panose="02110004020202020204"/>
         <a:ea typeface=""/>
         <a:cs typeface=""/>
         <a:font script="Jpan" typeface="游明朝"/>

</xml_diff>